<commit_message>
docs: update the living progress report
</commit_message>
<xml_diff>
--- a/docs/PROGRESS_REPORT.docx
+++ b/docs/PROGRESS_REPORT.docx
@@ -63,7 +63,7 @@
           <w:sz w:val="24"/>
           <w:szCs w:val="24"/>
         </w:rPr>
-        <w:t xml:space="preserve">28 September 2026</w:t>
+        <w:t xml:space="preserve">2 October 2026</w:t>
       </w:r>
     </w:p>
     <w:p>
@@ -169,7 +169,7 @@
           <w:sz w:val="24"/>
           <w:szCs w:val="24"/>
         </w:rPr>
-        <w:t xml:space="preserve">Phase 1, Data: in progress. Both datasets are fully downloaded and verified; I still need to build the code that converts them into a training-ready format.</w:t>
+        <w:t xml:space="preserve">Phase 1, Data: complete. Both datasets are downloaded, verified, and converted into one real training-ready dataset, split by sequence and leakage-checked.</w:t>
       </w:r>
     </w:p>
     <w:p>
@@ -190,7 +190,7 @@
           <w:sz w:val="24"/>
           <w:szCs w:val="24"/>
         </w:rPr>
-        <w:t xml:space="preserve">Phase 2, Pipeline: built and tested end to end on a stand-in model, including real video. Two small items are still blocked on Phase 1.</w:t>
+        <w:t xml:space="preserve">Phase 2, Pipeline: built and tested end to end on a stand-in model, including on three real validation sequences. One item (a zero-shot metric baseline) needs an evaluation harness I have not built yet.</w:t>
       </w:r>
     </w:p>
     <w:p>
@@ -211,7 +211,7 @@
           <w:sz w:val="24"/>
           <w:szCs w:val="24"/>
         </w:rPr>
-        <w:t xml:space="preserve">Phase 3, Training: my Colab notebook is ready. I have not run it yet.</w:t>
+        <w:t xml:space="preserve">Phase 3, Training: the dataset and the Colab notebook are both ready. I have not run the notebook yet; that is the one piece of this project that genuinely has to happen on Colab, not here.</w:t>
       </w:r>
     </w:p>
     <w:p>
@@ -421,23 +421,23 @@
           <w:sz w:val="24"/>
           <w:szCs w:val="24"/>
         </w:rPr>
-        <w:t xml:space="preserve"> is also fully downloaded now, including the 9.85 GB video-frame archive, and every file is hash-verified. Its original official host has been dead for some time (every published link now redirects to a generic page), so I had to find and use a live alternative source. Going through its annotation files directly, I confirmed its real structure and confirmed it uses exactly four vehicle classes (car, van, bus, and an “others” category), with 598,281 labelled boxes across 61 training sequences and 41 test sequences, and zero two-wheeler labels of any kind. That last point matters: it means I cannot casually merge DhakaAI's motorbike and scooter labels into the combined dataset without thinking it through first, since UA-DETRAC would then be full of unlabelled motorbikes in its background, which would actively confuse training.</w:t>
-      </w:r>
-    </w:p>
-    <w:p>
-      <w:pPr>
-        <w:spacing w:after="200" w:line="360"/>
-        <w:jc w:val="both"/>
-      </w:pPr>
-      <w:r>
-        <w:rPr>
-          <w:rFonts w:ascii="Times New Roman" w:cs="Times New Roman" w:eastAsia="Times New Roman" w:hAnsi="Times New Roman"/>
-          <w:b w:val="false"/>
-          <w:bCs w:val="false"/>
-          <w:sz w:val="24"/>
-          <w:szCs w:val="24"/>
-        </w:rPr>
-        <w:t xml:space="preserve">What is left in this phase: the datasets are ready, but the code that turns them into a single, training-ready dataset is not built yet. That is the actual next piece of work: a parser for UA-DETRAC's XML format (I already built one for DhakaAI's Pascal VOC format), a script to explore and sanity-check the combined data, a converter into the YOLO training format, and a splitter that keeps entire video sequences together between training and validation, so the model is never tested on frames it has effectively already seen. I also still need to make two judgement calls on the exact vehicle-class list before that converter can be finished: how to treat DhakaAI's three overlapping “small three-wheeler” classes (rickshaw, three-wheeler CNG, and auto-rickshaw), and whether to add a separate ambulance class. Both are genuinely my own call to make, not something that can be scripted or guessed.</w:t>
+        <w:t xml:space="preserve"> is also fully downloaded, including the 9.85 GB video-frame archive, and every file is hash-verified. Its original official host has been dead for some time (every published link now redirects to a generic page), so I had to find and use a live alternative source. Going through its annotation files directly with code I wrote and tested against the real files, I confirmed its real structure and confirmed it uses exactly four vehicle classes (car, van, bus, and an “others” category), with 598,281 labelled boxes across 60 training sequences and 40 test sequences (100 total, matching the original citation exactly; an earlier quick count of 61 and 41 was wrong and I have corrected it), and zero two-wheeler labels of any kind. That last point matters: it means I cannot casually merge DhakaAI's motorbike and scooter labels into the combined dataset without thinking it through first, since UA-DETRAC would then be full of unlabelled motorbikes in its background, which would actively confuse training.</w:t>
+      </w:r>
+    </w:p>
+    <w:p>
+      <w:pPr>
+        <w:spacing w:after="200" w:line="360"/>
+        <w:jc w:val="both"/>
+      </w:pPr>
+      <w:r>
+        <w:rPr>
+          <w:rFonts w:ascii="Times New Roman" w:cs="Times New Roman" w:eastAsia="Times New Roman" w:hAnsi="Times New Roman"/>
+          <w:b w:val="false"/>
+          <w:bCs w:val="false"/>
+          <w:sz w:val="24"/>
+          <w:szCs w:val="24"/>
+        </w:rPr>
+        <w:t xml:space="preserve">I have now settled the vehicle-class question and built the actual dataset. My own taxonomy rule, written down before I had the real numbers, already said what to do once UA-DETRAC's two-wheeler labels turned out to be zero: use four classes (car, van, bus, other), and do not fold DhakaAI's rickshaws, CNGs, motorbikes, scooters, bicycles, and wheelbarrows into any of them, since that would teach the model a shape UA-DETRAC's own unlabelled background actively contradicts. So those classes are dropped from training rather than merged, and an ambulance is counted as other, which I think is the sensible default. I wrote the UA-DETRAC parser (the one piece that did not already exist), the converter, and the dataset splitter, tested all of it, and then ran it for real on the full datasets: 16,427 real UA-DETRAC images (50 training sequences, 10 validation sequences, held out by whole sequence so the model is never validated on footage it effectively already trained on) and 3,000 real DhakaAI images, packaged into one 3.49 GB dataset ready for Colab, with its checksum recorded. While building this I found two small real defects in DhakaAI's files (two images with a zero recorded size, and every image's filename inside its label not actually matching the file in the archive) and handled both rather than let them silently corrupt anything.</w:t>
       </w:r>
     </w:p>
     <w:p>
@@ -501,7 +501,7 @@
           <w:sz w:val="24"/>
           <w:szCs w:val="24"/>
         </w:rPr>
-        <w:t xml:space="preserve">Two small items in this phase are still open, and both are blocked on Phase 1 rather than on anything in the pipeline itself: running the pipeline on three real validation sequences, and logging a zero-shot baseline before any training happens.</w:t>
+        <w:t xml:space="preserve">I have now run the pipeline on three of my real validation sequences (one each in sunny, cloudy, and rainy weather, matching how I chose the validation set), not just the one sample clip from before: real detections, real tracking, a valid incident log and annotated video for each. The other item, a zero-shot accuracy baseline, is still genuinely open: it needs a real precision, recall, and mAP evaluation against ground truth, which needs an evaluation harness I have not built yet. That is real remaining work, not a formality, and I am not going to claim it is done before it is.</w:t>
       </w:r>
     </w:p>
     <w:p>
@@ -533,7 +533,23 @@
           <w:sz w:val="24"/>
           <w:szCs w:val="24"/>
         </w:rPr>
-        <w:t xml:space="preserve">My Colab notebook is fully built: from a completely blank Colab session, it clones the repository, installs the exact pinned package versions, stages the dataset from Drive with a hash check, runs a quick smoke test, then trains and compares models, checkpointing regularly so a dropped Colab session does not lose progress. I have not run it yet, since it depends on the Phase 1 conversion work above. When I do run it, the plan is three training runs: a YOLOv8n baseline on UA-DETRAC alone, a stronger YOLOv8s run on UA-DETRAC alone, and a third run adding DhakaAI to the training data, so I can see directly whether the second dataset actually helps or not, rather than assuming it does.</w:t>
+        <w:t xml:space="preserve">To be completely clear about where I actually am: I have not trained a model. Everything built and demonstrated so far, the full pipeline, every test clip, the dashboard, runs on a ready-made, off-the-shelf YOLOv8n model published by Ultralytics, trained by them on a general-purpose dataset called COCO, not on traffic footage at all. I use it only because it already knows what a car, bus, truck, or motorcycle looks like in general, which is enough to build and test the rest of the system (tracking, the three rules, the CSV log, the dashboard) honestly while my own model is not ready yet. Every output it produces is labelled coco_standin everywhere in the code and the reports, specifically so it can never be mistaken for a real, trained result later.</w:t>
+      </w:r>
+    </w:p>
+    <w:p>
+      <w:pPr>
+        <w:spacing w:after="200" w:line="360"/>
+        <w:jc w:val="both"/>
+      </w:pPr>
+      <w:r>
+        <w:rPr>
+          <w:rFonts w:ascii="Times New Roman" w:cs="Times New Roman" w:eastAsia="Times New Roman" w:hAnsi="Times New Roman"/>
+          <w:b w:val="false"/>
+          <w:bCs w:val="false"/>
+          <w:sz w:val="24"/>
+          <w:szCs w:val="24"/>
+        </w:rPr>
+        <w:t xml:space="preserve">Training my own model means retraining that same YOLOv8 architecture on my two real datasets instead, so it learns my actual four classes (car, van, bus, other) from real UA-DETRAC and DhakaAI footage rather than COCO's generic ones. My Colab notebook for this is fully built: from a completely blank Colab session, it clones the repository, installs the exact pinned package versions, stages the dataset from Drive with a hash check, runs a quick smoke test, then trains and compares models, checkpointing regularly so a dropped Colab session does not lose progress. The dataset it needs is now built and ready (above). I have not run the notebook yet: training on Colab is the one part of this project that genuinely cannot happen anywhere except Colab, since it needs a GPU my own machine does not have, and it has to be me who runs it and brings the results back, not something that finishes inside a terminal session. When I do run it, the plan is three training runs: a YOLOv8n baseline on UA-DETRAC alone, a stronger YOLOv8s run on UA-DETRAC alone, and a third run adding DhakaAI to the training data, so I can see directly whether the second dataset actually helps or not, rather than assuming it does. Once one of those finishes and I bring the weights back, I drop them into the system in place of the stand-in model, no code changes needed, and everything after that (calibration, the five-metric evaluation, the real thesis numbers) can start.</w:t>
       </w:r>
     </w:p>
     <w:p>
@@ -629,7 +645,7 @@
           <w:sz w:val="24"/>
           <w:szCs w:val="24"/>
         </w:rPr>
-        <w:t xml:space="preserve">I take testing seriously throughout, not just at the end. The fast core test suite has 370 tests passing with zero failures, and the 41 hand-computed rule tests and 2 real-model tests, which I run separately because they are slower, pass as well. The dashboard's backend has 63 tests, including one that drives a real video through the real model end to end, all passing. My linter reports zero issues across the whole codebase, and the dashboard's frontend builds and lints cleanly. Every run of the system writes a full reproducibility record, so any number I eventually report can be traced back to exactly the code, configuration, and data that produced it.</w:t>
+        <w:t xml:space="preserve">I take testing seriously throughout, not just at the end. The fast core test suite has 474 tests passing with zero failures, and the 41 hand-computed rule tests and 2 real-model tests, which I run separately because they are slower, pass as well. The dashboard's backend has 63 tests, including one that drives a real video through the real model end to end, all passing. My linter reports zero issues across the whole codebase, and the dashboard's frontend builds and lints cleanly. Building the data converter also caught two real bugs before they could quietly corrupt the dataset (described above), both found by actually running it against the real archives rather than trusting a smaller test fixture alone. Every run of the system writes a full reproducibility record, so any number I eventually report can be traced back to exactly the code, configuration, and data that produced it.</w:t>
       </w:r>
     </w:p>
     <w:p>
@@ -750,6 +766,27 @@
     </w:p>
     <w:p>
       <w:pPr>
+        <w:pStyle w:val="ListParagraph"/>
+        <w:numPr>
+          <w:ilvl w:val="0"/>
+          <w:numId w:val="2"/>
+        </w:numPr>
+        <w:spacing w:after="120" w:line="360"/>
+        <w:jc w:val="both"/>
+      </w:pPr>
+      <w:r>
+        <w:rPr>
+          <w:rFonts w:ascii="Times New Roman" w:cs="Times New Roman" w:eastAsia="Times New Roman" w:hAnsi="Times New Roman"/>
+          <w:b w:val="false"/>
+          <w:bCs w:val="false"/>
+          <w:sz w:val="24"/>
+          <w:szCs w:val="24"/>
+        </w:rPr>
+        <w:t xml:space="preserve">I have stopped pacing this project by week. My original plan spread the work over nine weeks; I am now closing each phase the moment its real dependency is ready instead, which is why Phases 0, 1, and part of Phase 2 all closed well ahead of their original dates. The two things that genuinely cannot be sped up this way are Colab's own GPU training time and the actual writing of my thesis chapters once I have real results; both still take the time they take.</w:t>
+      </w:r>
+    </w:p>
+    <w:p>
+      <w:pPr>
         <w:spacing w:after="200" w:line="360"/>
         <w:jc w:val="both"/>
       </w:pPr>
@@ -798,7 +835,7 @@
           <w:sz w:val="24"/>
           <w:szCs w:val="24"/>
         </w:rPr>
-        <w:t xml:space="preserve">Build the actual Phase 1 conversion pipeline now that both datasets are downloaded: the UA-DETRAC parser, an exploratory data analysis script, the YOLO-format converter, and the sequence-level splitter with its leakage check.</w:t>
+        <w:t xml:space="preserve">Run the Colab training notebook myself: the three-run comparison across model sizes and datasets. The dataset and notebook are both ready; this is the next real step, and it is mine to do, not something that finishes inside a terminal session.</w:t>
       </w:r>
     </w:p>
     <w:p>
@@ -819,49 +856,7 @@
           <w:sz w:val="24"/>
           <w:szCs w:val="24"/>
         </w:rPr>
-        <w:t xml:space="preserve">Settle the two remaining vehicle-class judgement calls mentioned above, since the converter needs a final answer before it can run.</w:t>
-      </w:r>
-    </w:p>
-    <w:p>
-      <w:pPr>
-        <w:pStyle w:val="ListParagraph"/>
-        <w:numPr>
-          <w:ilvl w:val="0"/>
-          <w:numId w:val="3"/>
-        </w:numPr>
-        <w:spacing w:after="120" w:line="360"/>
-        <w:jc w:val="both"/>
-      </w:pPr>
-      <w:r>
-        <w:rPr>
-          <w:rFonts w:ascii="Times New Roman" w:cs="Times New Roman" w:eastAsia="Times New Roman" w:hAnsi="Times New Roman"/>
-          <w:b w:val="false"/>
-          <w:bCs w:val="false"/>
-          <w:sz w:val="24"/>
-          <w:szCs w:val="24"/>
-        </w:rPr>
-        <w:t xml:space="preserve">Run the three validation sequences and the zero-shot baseline through the pipeline, closing out Phase 2.</w:t>
-      </w:r>
-    </w:p>
-    <w:p>
-      <w:pPr>
-        <w:pStyle w:val="ListParagraph"/>
-        <w:numPr>
-          <w:ilvl w:val="0"/>
-          <w:numId w:val="3"/>
-        </w:numPr>
-        <w:spacing w:after="120" w:line="360"/>
-        <w:jc w:val="both"/>
-      </w:pPr>
-      <w:r>
-        <w:rPr>
-          <w:rFonts w:ascii="Times New Roman" w:cs="Times New Roman" w:eastAsia="Times New Roman" w:hAnsi="Times New Roman"/>
-          <w:b w:val="false"/>
-          <w:bCs w:val="false"/>
-          <w:sz w:val="24"/>
-          <w:szCs w:val="24"/>
-        </w:rPr>
-        <w:t xml:space="preserve">Run the Colab training notebook: the three-run comparison across model sizes and datasets.</w:t>
+        <w:t xml:space="preserve">Build the zero-shot evaluation harness (precision, recall, mAP against ground truth) to close the one remaining item in Phase 2 and give me a true before-and-after comparison once training is done.</w:t>
       </w:r>
     </w:p>
     <w:p>

</xml_diff>

<commit_message>
chore(repo): keep planning, decision and run-log documents out of the tracked tree
</commit_message>
<xml_diff>
--- a/docs/PROGRESS_REPORT.docx
+++ b/docs/PROGRESS_REPORT.docx
@@ -63,7 +63,7 @@
           <w:sz w:val="24"/>
           <w:szCs w:val="24"/>
         </w:rPr>
-        <w:t xml:space="preserve">2 October 2026</w:t>
+        <w:t xml:space="preserve">3 October 2026</w:t>
       </w:r>
     </w:p>
     <w:p>
@@ -190,7 +190,7 @@
           <w:sz w:val="24"/>
           <w:szCs w:val="24"/>
         </w:rPr>
-        <w:t xml:space="preserve">Phase 2, Pipeline: built and tested end to end on a stand-in model, including on three real validation sequences. One item (a zero-shot metric baseline) needs an evaluation harness I have not built yet.</w:t>
+        <w:t xml:space="preserve">Phase 2, Pipeline: built and tested end to end on a stand-in model, including on three real validation sequences. The zero-shot baseline is now measured: detector scores on my full validation split and a latency measurement on a full real sequence.</w:t>
       </w:r>
     </w:p>
     <w:p>
@@ -232,7 +232,7 @@
           <w:sz w:val="24"/>
           <w:szCs w:val="24"/>
         </w:rPr>
-        <w:t xml:space="preserve">Phases 4 to 7 (integration, evaluation, documentation, demo): not started, since each depends on a trained model.</w:t>
+        <w:t xml:space="preserve">Phase 5, Evaluation: the zero-shot baseline is done. The tracker check, incident-level precision and recall, and the single final test-split run wait for a trained model. Phases 4, 6 and 7 (integration, documentation, demo) are not started.</w:t>
       </w:r>
     </w:p>
     <w:p>
@@ -501,7 +501,7 @@
           <w:sz w:val="24"/>
           <w:szCs w:val="24"/>
         </w:rPr>
-        <w:t xml:space="preserve">I have now run the pipeline on three of my real validation sequences (one each in sunny, cloudy, and rainy weather, matching how I chose the validation set), not just the one sample clip from before: real detections, real tracking, a valid incident log and annotated video for each. The other item, a zero-shot accuracy baseline, is still genuinely open: it needs a real precision, recall, and mAP evaluation against ground truth, which needs an evaluation harness I have not built yet. That is real remaining work, not a formality, and I am not going to claim it is done before it is.</w:t>
+        <w:t xml:space="preserve">I have now run the pipeline on three of my real validation sequences (one each in sunny, cloudy, and rainy weather, matching how I chose the validation set), not just the one sample clip from before: real detections, real tracking, a valid incident log and annotated video for each. The zero-shot accuracy baseline is now measured as well, in the section below.</w:t>
       </w:r>
     </w:p>
     <w:p>
@@ -517,39 +517,87 @@
           <w:sz w:val="26"/>
           <w:szCs w:val="26"/>
         </w:rPr>
-        <w:t xml:space="preserve">Phase 3: Training, preparation</w:t>
-      </w:r>
-    </w:p>
-    <w:p>
-      <w:pPr>
-        <w:spacing w:after="200" w:line="360"/>
-        <w:jc w:val="both"/>
-      </w:pPr>
-      <w:r>
-        <w:rPr>
-          <w:rFonts w:ascii="Times New Roman" w:cs="Times New Roman" w:eastAsia="Times New Roman" w:hAnsi="Times New Roman"/>
-          <w:b w:val="false"/>
-          <w:bCs w:val="false"/>
-          <w:sz w:val="24"/>
-          <w:szCs w:val="24"/>
-        </w:rPr>
-        <w:t xml:space="preserve">To be completely clear about where I actually am: I have not trained a model. Everything built and demonstrated so far, the full pipeline, every test clip, the dashboard, runs on a ready-made, off-the-shelf YOLOv8n model published by Ultralytics, trained by them on a general-purpose dataset called COCO, not on traffic footage at all. I use it only because it already knows what a car, bus, truck, or motorcycle looks like in general, which is enough to build and test the rest of the system (tracking, the three rules, the CSV log, the dashboard) honestly while my own model is not ready yet. Every output it produces is labelled coco_standin everywhere in the code and the reports, specifically so it can never be mistaken for a real, trained result later.</w:t>
-      </w:r>
-    </w:p>
-    <w:p>
-      <w:pPr>
-        <w:spacing w:after="200" w:line="360"/>
-        <w:jc w:val="both"/>
-      </w:pPr>
-      <w:r>
-        <w:rPr>
-          <w:rFonts w:ascii="Times New Roman" w:cs="Times New Roman" w:eastAsia="Times New Roman" w:hAnsi="Times New Roman"/>
-          <w:b w:val="false"/>
-          <w:bCs w:val="false"/>
-          <w:sz w:val="24"/>
-          <w:szCs w:val="24"/>
-        </w:rPr>
-        <w:t xml:space="preserve">Training my own model means retraining that same YOLOv8 architecture on my two real datasets instead, so it learns my actual four classes (car, van, bus, other) from real UA-DETRAC and DhakaAI footage rather than COCO's generic ones. My Colab notebook for this is fully built: from a completely blank Colab session, it clones the repository, installs the exact pinned package versions, stages the dataset from Drive with a hash check, runs a quick smoke test, then trains and compares models, checkpointing regularly so a dropped Colab session does not lose progress. The dataset it needs is now built and ready (above). I have not run the notebook yet: training on Colab is the one part of this project that genuinely cannot happen anywhere except Colab, since it needs a GPU my own machine does not have, and it has to be me who runs it and brings the results back, not something that finishes inside a terminal session. When I do run it, the plan is three training runs: a YOLOv8n baseline on UA-DETRAC alone, a stronger YOLOv8s run on UA-DETRAC alone, and a third run adding DhakaAI to the training data, so I can see directly whether the second dataset actually helps or not, rather than assuming it does. Once one of those finishes and I bring the weights back, I drop them into the system in place of the stand-in model, no code changes needed, and everything after that (calibration, the five-metric evaluation, the real thesis numbers) can start.</w:t>
+        <w:t xml:space="preserve">Zero-shot baseline: what the stand-in model scores before any training</w:t>
+      </w:r>
+    </w:p>
+    <w:p>
+      <w:pPr>
+        <w:spacing w:after="200" w:line="360"/>
+        <w:jc w:val="both"/>
+      </w:pPr>
+      <w:r>
+        <w:rPr>
+          <w:rFonts w:ascii="Times New Roman" w:cs="Times New Roman" w:eastAsia="Times New Roman" w:hAnsi="Times New Roman"/>
+          <w:b w:val="false"/>
+          <w:bCs w:val="false"/>
+          <w:sz w:val="24"/>
+          <w:szCs w:val="24"/>
+        </w:rPr>
+        <w:t xml:space="preserve">Before training, I measured how well the off-the-shelf model already does on my validation data, so the trained model has a real starting point to beat. I ran the stand-in detector over all 2,572 UA-DETRAC validation images and all 300 DhakaAI validation images, and scored every detection against my own ground-truth labels. A detection counts only when its box overlaps a real vehicle box by at least half (intersection-over-union of 0.5). This is a stand-in result, labelled as such throughout, and it does not appear in any final results table.</w:t>
+      </w:r>
+    </w:p>
+    <w:p>
+      <w:pPr>
+        <w:spacing w:after="200" w:line="360"/>
+        <w:jc w:val="both"/>
+      </w:pPr>
+      <w:r>
+        <w:rPr>
+          <w:rFonts w:ascii="Times New Roman" w:cs="Times New Roman" w:eastAsia="Times New Roman" w:hAnsi="Times New Roman"/>
+          <w:b w:val="false"/>
+          <w:bCs w:val="false"/>
+          <w:sz w:val="24"/>
+          <w:szCs w:val="24"/>
+        </w:rPr>
+        <w:t xml:space="preserve">On UA-DETRAC validation, at my configured confidence threshold of 0.35, precision is 0.939 and recall is 0.761. Mean average precision is 0.377 at that overlap threshold, and 0.223 averaged over thresholds from 0.5 to 0.95. Recall is highest in sunny weather (0.819) and lowest in rain (0.714), while precision stays between 0.93 and 0.97 in all four conditions. On the DhakaAI validation images, a different camera and traffic mix, performance drops sharply: precision 0.678, recall 0.519, mean average precision 0.323 at 0.5. That gap is why I expect training on those images to matter.</w:t>
+      </w:r>
+    </w:p>
+    <w:p>
+      <w:pPr>
+        <w:spacing w:after="200" w:line="360"/>
+        <w:jc w:val="both"/>
+      </w:pPr>
+      <w:r>
+        <w:rPr>
+          <w:rFonts w:ascii="Times New Roman" w:cs="Times New Roman" w:eastAsia="Times New Roman" w:hAnsi="Times New Roman"/>
+          <w:b w:val="false"/>
+          <w:bCs w:val="false"/>
+          <w:sz w:val="24"/>
+          <w:szCs w:val="24"/>
+        </w:rPr>
+        <w:t xml:space="preserve">The per-class numbers explain most of the average. Car and bus score reasonably (average precision 0.786 and 0.684 on UA-DETRAC validation). The off-the-shelf model has no van class, so it can never detect a van: its vans come out as cars, and van scores zero. The other class, fed only by COCO's truck class, scores 0.040. I am reporting those zeros rather than hiding them, because they are real limits of the zero-shot model and are exactly what training on my four classes is meant to fix.</w:t>
+      </w:r>
+    </w:p>
+    <w:p>
+      <w:pPr>
+        <w:spacing w:after="200" w:line="360"/>
+        <w:jc w:val="both"/>
+      </w:pPr>
+      <w:r>
+        <w:rPr>
+          <w:rFonts w:ascii="Times New Roman" w:cs="Times New Roman" w:eastAsia="Times New Roman" w:hAnsi="Times New Roman"/>
+          <w:b w:val="false"/>
+          <w:bCs w:val="false"/>
+          <w:sz w:val="24"/>
+          <w:szCs w:val="24"/>
+        </w:rPr>
+        <w:t xml:space="preserve">Latency on my development machine (CPU only, no GPU): the full pipeline took a mean of 498.6 milliseconds per frame over 1,440 measured frames of a real 1,490-frame validation sequence, about two frames per second. Tracking took the largest share, 326 milliseconds per frame, ahead of detection at 164 milliseconds. That is the first thing I would optimise, and it means the system is not yet real-time on this machine.</w:t>
+      </w:r>
+    </w:p>
+    <w:p>
+      <w:pPr>
+        <w:spacing w:after="200" w:line="360"/>
+        <w:jc w:val="both"/>
+      </w:pPr>
+      <w:r>
+        <w:rPr>
+          <w:rFonts w:ascii="Times New Roman" w:cs="Times New Roman" w:eastAsia="Times New Roman" w:hAnsi="Times New Roman"/>
+          <w:b w:val="false"/>
+          <w:bCs w:val="false"/>
+          <w:sz w:val="24"/>
+          <w:szCs w:val="24"/>
+        </w:rPr>
+        <w:t xml:space="preserve">Every number here comes from a recorded run with its configuration, weights checksum, and data manifest attached, and each is written up with its run identifier in my evaluation log. One honest caveat: the detector run was made with uncommitted code changes, so I will repeat it from a clean checkout before any of these figures goes into my thesis.</w:t>
       </w:r>
     </w:p>
     <w:p>
@@ -565,6 +613,54 @@
           <w:sz w:val="26"/>
           <w:szCs w:val="26"/>
         </w:rPr>
+        <w:t xml:space="preserve">Phase 3: Training, preparation</w:t>
+      </w:r>
+    </w:p>
+    <w:p>
+      <w:pPr>
+        <w:spacing w:after="200" w:line="360"/>
+        <w:jc w:val="both"/>
+      </w:pPr>
+      <w:r>
+        <w:rPr>
+          <w:rFonts w:ascii="Times New Roman" w:cs="Times New Roman" w:eastAsia="Times New Roman" w:hAnsi="Times New Roman"/>
+          <w:b w:val="false"/>
+          <w:bCs w:val="false"/>
+          <w:sz w:val="24"/>
+          <w:szCs w:val="24"/>
+        </w:rPr>
+        <w:t xml:space="preserve">To be completely clear about where I actually am: I have not trained a model. Everything built and demonstrated so far, the full pipeline, every test clip, the dashboard, runs on a ready-made, off-the-shelf YOLOv8n model published by Ultralytics, trained by them on a general-purpose dataset called COCO, not on traffic footage at all. I use it only because it already knows what a car, bus, truck, or motorcycle looks like in general, which is enough to build and test the rest of the system (tracking, the three rules, the CSV log, the dashboard) honestly while my own model is not ready yet. Every output it produces is labelled coco_standin everywhere in the code and the reports, specifically so it can never be mistaken for a real, trained result later.</w:t>
+      </w:r>
+    </w:p>
+    <w:p>
+      <w:pPr>
+        <w:spacing w:after="200" w:line="360"/>
+        <w:jc w:val="both"/>
+      </w:pPr>
+      <w:r>
+        <w:rPr>
+          <w:rFonts w:ascii="Times New Roman" w:cs="Times New Roman" w:eastAsia="Times New Roman" w:hAnsi="Times New Roman"/>
+          <w:b w:val="false"/>
+          <w:bCs w:val="false"/>
+          <w:sz w:val="24"/>
+          <w:szCs w:val="24"/>
+        </w:rPr>
+        <w:t xml:space="preserve">Training my own model means retraining that same YOLOv8 architecture on my two real datasets instead, so it learns my actual four classes (car, van, bus, other) from real UA-DETRAC and DhakaAI footage rather than COCO's generic ones. My Colab notebook for this is fully built: from a completely blank Colab session, it clones the repository, installs the exact pinned package versions, stages the dataset from Drive with a hash check, runs a quick smoke test, then trains and compares models, checkpointing regularly so a dropped Colab session does not lose progress. The dataset it needs is now built and ready (above). I have not run the notebook yet: training on Colab is the one part of this project that genuinely cannot happen anywhere except Colab, since it needs a GPU my own machine does not have, and it has to be me who runs it and brings the results back, not something that finishes inside a terminal session. When I do run it, the plan is three training runs: a YOLOv8n baseline on UA-DETRAC alone, a stronger YOLOv8s run on UA-DETRAC alone, and a third run adding DhakaAI to the training data, so I can see directly whether the second dataset actually helps or not, rather than assuming it does. Once one of those finishes and I bring the weights back, I drop them into the system in place of the stand-in model, no code changes needed, and everything after that (calibration, the five-metric evaluation, the real thesis numbers) can start.</w:t>
+      </w:r>
+    </w:p>
+    <w:p>
+      <w:pPr>
+        <w:pStyle w:val="Heading2"/>
+        <w:spacing w:after="120" w:before="240" w:line="360"/>
+      </w:pPr>
+      <w:r>
+        <w:rPr>
+          <w:rFonts w:ascii="Times New Roman" w:cs="Times New Roman" w:eastAsia="Times New Roman" w:hAnsi="Times New Roman"/>
+          <w:b/>
+          <w:bCs/>
+          <w:sz w:val="26"/>
+          <w:szCs w:val="26"/>
+        </w:rPr>
         <w:t xml:space="preserve">A supplementary web dashboard</w:t>
       </w:r>
     </w:p>
@@ -645,7 +741,7 @@
           <w:sz w:val="24"/>
           <w:szCs w:val="24"/>
         </w:rPr>
-        <w:t xml:space="preserve">I take testing seriously throughout, not just at the end. The fast core test suite has 474 tests passing with zero failures, and the 41 hand-computed rule tests and 2 real-model tests, which I run separately because they are slower, pass as well. The dashboard's backend has 63 tests, including one that drives a real video through the real model end to end, all passing. My linter reports zero issues across the whole codebase, and the dashboard's frontend builds and lints cleanly. Building the data converter also caught two real bugs before they could quietly corrupt the dataset (described above), both found by actually running it against the real archives rather than trusting a smaller test fixture alone. Every run of the system writes a full reproducibility record, so any number I eventually report can be traced back to exactly the code, configuration, and data that produced it.</w:t>
+        <w:t xml:space="preserve">I take testing seriously throughout, not just at the end. The fast core test suite has 535 tests passing with zero failures, and the 41 hand-computed rule tests and 2 real-model tests, which I run separately because they are slower, pass as well. The dashboard's backend has 63 tests, including one that drives a real video through the real model end to end, all passing. My linter reports zero issues across the whole codebase, and the dashboard's frontend builds and lints cleanly. Building the data converter also caught two real bugs before they could quietly corrupt the dataset (described above), both found by actually running it against the real archives rather than trusting a smaller test fixture alone. Every run of the system writes a full reproducibility record, so any number I eventually report can be traced back to exactly the code, configuration, and data that produced it.</w:t>
       </w:r>
     </w:p>
     <w:p>
@@ -856,7 +952,7 @@
           <w:sz w:val="24"/>
           <w:szCs w:val="24"/>
         </w:rPr>
-        <w:t xml:space="preserve">Build the zero-shot evaluation harness (precision, recall, mAP against ground truth) to close the one remaining item in Phase 2 and give me a true before-and-after comparison once training is done.</w:t>
+        <w:t xml:space="preserve">Finish the evaluation: the tracker check, incident-level precision, recall and false-alarm rate against ground truth, and the single final test-split run once thresholds are frozen.</w:t>
       </w:r>
     </w:p>
     <w:p>

</xml_diff>